<commit_message>
fix: harden MATH6186 report validation
</commit_message>
<xml_diff>
--- a/report/MATH6186_case_study_draft.docx
+++ b/report/MATH6186_case_study_draft.docx
@@ -3218,7 +3218,35 @@
           <w:b w:val="0"/>
           <w:i w:val="0"/>
         </w:rPr>
-        <w:t>The generated contract consists of four CSV files in `outputs/data` and five PNG files in `outputs/figures`. Validate source integrity before building the document with:</w:t>
+        <w:t xml:space="preserve">The generated contract consists of four CSV files in </w:t>
+      </w:r>
+      <w:r>
+        <w:rPr>
+          <w:b w:val="0"/>
+          <w:i w:val="0"/>
+        </w:rPr>
+        <w:t>outputs/data</w:t>
+      </w:r>
+      <w:r>
+        <w:rPr>
+          <w:b w:val="0"/>
+          <w:i w:val="0"/>
+        </w:rPr>
+        <w:t xml:space="preserve"> and five PNG files in </w:t>
+      </w:r>
+      <w:r>
+        <w:rPr>
+          <w:b w:val="0"/>
+          <w:i w:val="0"/>
+        </w:rPr>
+        <w:t>outputs/figures</w:t>
+      </w:r>
+      <w:r>
+        <w:rPr>
+          <w:b w:val="0"/>
+          <w:i w:val="0"/>
+        </w:rPr>
+        <w:t>. Validate source integrity before building the document with:</w:t>
       </w:r>
     </w:p>
     <w:p>

</xml_diff>

<commit_message>
fix: complete report visual QA
</commit_message>
<xml_diff>
--- a/report/MATH6186_case_study_draft.docx
+++ b/report/MATH6186_case_study_draft.docx
@@ -1941,7 +1941,7 @@
                     <pic:cNvPicPr/>
                   </pic:nvPicPr>
                   <pic:blipFill>
-                    <a:blip r:embed="rId13"/>
+                    <a:blip r:embed="rId15"/>
                     <a:stretch>
                       <a:fillRect/>
                     </a:stretch>
@@ -2049,7 +2049,7 @@
                     <pic:cNvPicPr/>
                   </pic:nvPicPr>
                   <pic:blipFill>
-                    <a:blip r:embed="rId14"/>
+                    <a:blip r:embed="rId16"/>
                     <a:stretch>
                       <a:fillRect/>
                     </a:stretch>
@@ -2151,7 +2151,7 @@
                     <pic:cNvPicPr/>
                   </pic:nvPicPr>
                   <pic:blipFill>
-                    <a:blip r:embed="rId15"/>
+                    <a:blip r:embed="rId17"/>
                     <a:stretch>
                       <a:fillRect/>
                     </a:stretch>
@@ -2245,7 +2245,7 @@
                     <pic:cNvPicPr/>
                   </pic:nvPicPr>
                   <pic:blipFill>
-                    <a:blip r:embed="rId16"/>
+                    <a:blip r:embed="rId18"/>
                     <a:stretch>
                       <a:fillRect/>
                     </a:stretch>
@@ -2356,7 +2356,7 @@
                     <pic:cNvPicPr/>
                   </pic:nvPicPr>
                   <pic:blipFill>
-                    <a:blip r:embed="rId17"/>
+                    <a:blip r:embed="rId19"/>
                     <a:stretch>
                       <a:fillRect/>
                     </a:stretch>
@@ -3259,9 +3259,11 @@
     </w:p>
     <w:sectPr>
       <w:headerReference w:type="default" r:id="rId9"/>
-      <w:headerReference w:type="first" r:id="rId10"/>
-      <w:footerReference w:type="default" r:id="rId11"/>
-      <w:footerReference w:type="first" r:id="rId12"/>
+      <w:headerReference w:type="even" r:id="rId10"/>
+      <w:headerReference w:type="first" r:id="rId11"/>
+      <w:footerReference w:type="default" r:id="rId12"/>
+      <w:footerReference w:type="even" r:id="rId13"/>
+      <w:footerReference w:type="first" r:id="rId14"/>
       <w:pgSz w:w="12240" w:h="15840"/>
       <w:pgMar w:top="1440" w:right="1440" w:bottom="1440" w:left="1440" w:header="708" w:footer="708" w:gutter="0"/>
       <w:cols w:space="720"/>
@@ -3319,6 +3321,48 @@
   <w:p>
     <w:pPr>
       <w:pStyle w:val="Footer"/>
+      <w:spacing w:after="0"/>
+      <w:jc w:val="right"/>
+    </w:pPr>
+    <w:r>
+      <w:rPr>
+        <w:rFonts w:ascii="Calibri" w:hAnsi="Calibri"/>
+      </w:rPr>
+      <w:fldChar w:fldCharType="begin"/>
+    </w:r>
+    <w:r>
+      <w:rPr>
+        <w:rFonts w:ascii="Calibri" w:hAnsi="Calibri"/>
+      </w:rPr>
+      <w:instrText xml:space="preserve"> PAGE </w:instrText>
+    </w:r>
+    <w:r>
+      <w:rPr>
+        <w:rFonts w:ascii="Calibri" w:hAnsi="Calibri"/>
+      </w:rPr>
+      <w:fldChar w:fldCharType="separate"/>
+    </w:r>
+    <w:r>
+      <w:rPr>
+        <w:rFonts w:ascii="Calibri" w:hAnsi="Calibri"/>
+      </w:rPr>
+      <w:t>2</w:t>
+    </w:r>
+    <w:r>
+      <w:rPr>
+        <w:rFonts w:ascii="Calibri" w:hAnsi="Calibri"/>
+      </w:rPr>
+      <w:fldChar w:fldCharType="end"/>
+    </w:r>
+  </w:p>
+</w:ftr>
+</file>
+
+<file path=word/footer3.xml><?xml version="1.0" encoding="utf-8"?>
+<w:ftr xmlns:m="http://schemas.openxmlformats.org/officeDocument/2006/math" xmlns:mc="http://schemas.openxmlformats.org/markup-compatibility/2006" xmlns:mo="http://schemas.microsoft.com/office/mac/office/2008/main" xmlns:mv="urn:schemas-microsoft-com:mac:vml" xmlns:o="urn:schemas-microsoft-com:office:office" xmlns:r="http://schemas.openxmlformats.org/officeDocument/2006/relationships" xmlns:v="urn:schemas-microsoft-com:vml" xmlns:w10="urn:schemas-microsoft-com:office:word" xmlns:w14="http://schemas.microsoft.com/office/word/2010/wordml" xmlns:w="http://schemas.openxmlformats.org/wordprocessingml/2006/main" xmlns:wne="http://schemas.microsoft.com/office/word/2006/wordml" xmlns:wp14="http://schemas.microsoft.com/office/word/2010/wordprocessingDrawing" xmlns:wp="http://schemas.openxmlformats.org/drawingml/2006/wordprocessingDrawing" xmlns:wpc="http://schemas.microsoft.com/office/word/2010/wordprocessingCanvas" xmlns:wpg="http://schemas.microsoft.com/office/word/2010/wordprocessingGroup" xmlns:wpi="http://schemas.microsoft.com/office/word/2010/wordprocessingInk" xmlns:wps="http://schemas.microsoft.com/office/word/2010/wordprocessingShape" mc:Ignorable="w14 wp14">
+  <w:p>
+    <w:pPr>
+      <w:pStyle w:val="Footer"/>
     </w:pPr>
     <w:r/>
   </w:p>
@@ -3346,6 +3390,26 @@
 </file>
 
 <file path=word/header2.xml><?xml version="1.0" encoding="utf-8"?>
+<w:hdr xmlns:m="http://schemas.openxmlformats.org/officeDocument/2006/math" xmlns:mc="http://schemas.openxmlformats.org/markup-compatibility/2006" xmlns:mo="http://schemas.microsoft.com/office/mac/office/2008/main" xmlns:mv="urn:schemas-microsoft-com:mac:vml" xmlns:o="urn:schemas-microsoft-com:office:office" xmlns:r="http://schemas.openxmlformats.org/officeDocument/2006/relationships" xmlns:v="urn:schemas-microsoft-com:vml" xmlns:w10="urn:schemas-microsoft-com:office:word" xmlns:w14="http://schemas.microsoft.com/office/word/2010/wordml" xmlns:w="http://schemas.openxmlformats.org/wordprocessingml/2006/main" xmlns:wne="http://schemas.microsoft.com/office/word/2006/wordml" xmlns:wp14="http://schemas.microsoft.com/office/word/2010/wordprocessingDrawing" xmlns:wp="http://schemas.openxmlformats.org/drawingml/2006/wordprocessingDrawing" xmlns:wpc="http://schemas.microsoft.com/office/word/2010/wordprocessingCanvas" xmlns:wpg="http://schemas.microsoft.com/office/word/2010/wordprocessingGroup" xmlns:wpi="http://schemas.microsoft.com/office/word/2010/wordprocessingInk" xmlns:wps="http://schemas.microsoft.com/office/word/2010/wordprocessingShape" mc:Ignorable="w14 wp14">
+  <w:p>
+    <w:pPr>
+      <w:pStyle w:val="Header"/>
+      <w:spacing w:after="0"/>
+      <w:jc w:val="left"/>
+    </w:pPr>
+    <w:r>
+      <w:rPr>
+        <w:rFonts w:ascii="Calibri" w:hAnsi="Calibri"/>
+        <w:color w:val="6B7280"/>
+        <w:sz w:val="18"/>
+      </w:rPr>
+      <w:t>MATH6186 | Worried-Well Consultation Capacity</w:t>
+    </w:r>
+  </w:p>
+</w:hdr>
+</file>
+
+<file path=word/header3.xml><?xml version="1.0" encoding="utf-8"?>
 <w:hdr xmlns:m="http://schemas.openxmlformats.org/officeDocument/2006/math" xmlns:mc="http://schemas.openxmlformats.org/markup-compatibility/2006" xmlns:mo="http://schemas.microsoft.com/office/mac/office/2008/main" xmlns:mv="urn:schemas-microsoft-com:mac:vml" xmlns:o="urn:schemas-microsoft-com:office:office" xmlns:r="http://schemas.openxmlformats.org/officeDocument/2006/relationships" xmlns:v="urn:schemas-microsoft-com:vml" xmlns:w10="urn:schemas-microsoft-com:office:word" xmlns:w14="http://schemas.microsoft.com/office/word/2010/wordml" xmlns:w="http://schemas.openxmlformats.org/wordprocessingml/2006/main" xmlns:wne="http://schemas.microsoft.com/office/word/2006/wordml" xmlns:wp14="http://schemas.microsoft.com/office/word/2010/wordprocessingDrawing" xmlns:wp="http://schemas.openxmlformats.org/drawingml/2006/wordprocessingDrawing" xmlns:wpc="http://schemas.microsoft.com/office/word/2010/wordprocessingCanvas" xmlns:wpg="http://schemas.microsoft.com/office/word/2010/wordprocessingGroup" xmlns:wpi="http://schemas.microsoft.com/office/word/2010/wordprocessingInk" xmlns:wps="http://schemas.microsoft.com/office/word/2010/wordprocessingShape" mc:Ignorable="w14 wp14">
   <w:p>
     <w:pPr>
@@ -4093,9 +4157,6 @@
     <w:rsid w:val="00FC693F"/>
     <w:pPr>
       <w:keepNext/>
-      <w:pBdr>
-        <w:bottom w:val="single" w:sz="8" w:space="4" w:color="4F81BD" w:themeColor="accent1"/>
-      </w:pBdr>
       <w:spacing w:after="240" w:line="240" w:lineRule="auto" w:before="0"/>
       <w:contextualSpacing/>
       <w:jc w:val="center"/>

</xml_diff>

<commit_message>
fix: normalize inline math subscripts
</commit_message>
<xml_diff>
--- a/report/MATH6186_case_study_draft.docx
+++ b/report/MATH6186_case_study_draft.docx
@@ -455,7 +455,7 @@
           <w:b w:val="0"/>
           <w:i w:val="0"/>
         </w:rPr>
-        <w:t>The baseline parameters are adopted from Singh and Gromov’s structure and baseline scenario (Singh and Gromov, 2025). They are beta_P=0.74, beta_W=0.70, beta_{WP}=0.70, gamma_P=gamma_W=1/14, and delta_P=1/240. The initial state is (0.98, 0.01, 0.01, 0), ordered as susceptible, infected, worried-well, and recovered. The behavioural multiplier takes alpha=0.5 for cautious contact, alpha=1 for the default regime, and alpha=2 for high contact. The model is integrated over 50 days and recorded daily.</w:t>
+        <w:t>The baseline parameters are adopted from Singh and Gromov’s structure and baseline scenario (Singh and Gromov, 2025). They are beta_P=0.74, beta_W=0.70, beta_WP=0.70, gamma_P=gamma_W=1/14, and delta_P=1/240. The initial state is (0.98, 0.01, 0.01, 0), ordered as susceptible, infected, worried-well, and recovered. The behavioural multiplier takes alpha=0.5 for cautious contact, alpha=1 for the default regime, and alpha=2 for high contact. The model is integrated over 50 days and recorded daily.</w:t>
       </w:r>
     </w:p>
     <w:tbl>
@@ -1757,7 +1757,7 @@
           <w:b w:val="0"/>
           <w:i w:val="0"/>
         </w:rPr>
-        <w:t>Let q_t be the non-negative integer consultation capacity selected for day t, and let D_{ts} be demand in scenario s. Underage cost c_u applies to each unit of demand above capacity, while overage cost c_o applies to each unused unit of capacity. For an in-sample set of size M, the day-specific sample-average objective is:</w:t>
+        <w:t>Let q_t be the non-negative integer consultation capacity selected for day t, and let D_ts be demand in scenario s. Underage cost c_u applies to each unit of demand above capacity, while overage cost c_o applies to each unused unit of capacity. For an in-sample set of size M, the day-specific sample-average objective is:</w:t>
       </w:r>
     </w:p>
     <w:p>

</xml_diff>